<commit_message>
Add Claude Code to session 1, restructure to 4 sessions
Session 1 (40min): Terminal + Git + Node.js + Claude Code install & first chat
Session 2 (35min): Python install + YouTube API key + data collection program
Session 3 (35min): Run data collection + build dashboard + browser view
Session 4 (30min): GitHub signup + repository + push

Students get the "wow moment" of talking to AI in the very first session.

Co-Authored-By: Claude Opus 4.6 (1M context) <noreply@anthropic.com>
</commit_message>
<xml_diff>
--- a/ETF_유튜브_대시보드_강의안.docx
+++ b/ETF_유튜브_대시보드_강의안.docx
@@ -57,7 +57,7 @@
           <w:b/>
           <w:sz w:val="24"/>
         </w:rPr>
-        <w:t>구성: 총 6회차 (회차당 30분) | 총 소요 시간: 약 3시간</w:t>
+        <w:t>구성: 총 4회차 (회차당 30~40분) | 총 소요 시간: 약 2시간 20분</w:t>
       </w:r>
     </w:p>
     <w:p>
@@ -384,7 +384,7 @@
         <w:rPr>
           <w:rFonts w:ascii="맑은 고딕" w:hAnsi="맑은 고딕" w:eastAsia="맑은 고딕"/>
         </w:rPr>
-        <w:t>1회차: 터미널과 친해지기</w:t>
+        <w:t>1회차: 터미널부터 AI 비서까지 한 번에!</w:t>
       </w:r>
     </w:p>
     <w:p>
@@ -394,7 +394,7 @@
           <w:b/>
           <w:color w:val="0064C8"/>
         </w:rPr>
-        <w:t>소요 시간: 30분</w:t>
+        <w:t>소요 시간: 40분</w:t>
       </w:r>
     </w:p>
     <w:p>
@@ -403,7 +403,7 @@
           <w:rFonts w:ascii="맑은 고딕" w:hAnsi="맑은 고딕" w:eastAsia="맑은 고딕"/>
           <w:b/>
         </w:rPr>
-        <w:t>이 회차를 마치면: 까만 화면(터미널)이 더 이상 무섭지 않고, 컴퓨터에게 간단한 명령을 글자로 내릴 수 있어요!</w:t>
+        <w:t>이 회차를 마치면: 터미널, Git, Node.js를 설치하고, AI 비서 Claude Code와 첫 대화까지! "와, 이런 거구나!" 체험을 바로 해볼 수 있어요.</w:t>
       </w:r>
     </w:p>
     <w:p/>
@@ -953,6 +953,320 @@
         <w:rPr>
           <w:rFonts w:ascii="맑은 고딕" w:hAnsi="맑은 고딕" w:eastAsia="맑은 고딕"/>
         </w:rPr>
+        <w:t>Step 7. Node.js 설치하기 (7분)</w:t>
+      </w:r>
+    </w:p>
+    <w:p>
+      <w:r>
+        <w:t>&gt;&gt; Node.js(노드제이에스)가 뭔가요?</w:t>
+      </w:r>
+    </w:p>
+    <w:p>
+      <w:r>
+        <w:t>프로그램을 실행시켜주는 "엔진"이에요.</w:t>
+      </w:r>
+    </w:p>
+    <w:p>
+      <w:r>
+        <w:t>비유: 자동차(프로그램)가 달리려면 엔진(Node.js)이 필요한 것처럼,</w:t>
+      </w:r>
+    </w:p>
+    <w:p>
+      <w:r>
+        <w:t>Claude Code를 돌리려면 Node.js가 먼저 필요해요.</w:t>
+      </w:r>
+    </w:p>
+    <w:p/>
+    <w:p>
+      <w:r>
+        <w:t>브라우저에서 아래 주소로 이동하세요:</w:t>
+      </w:r>
+    </w:p>
+    <w:p>
+      <w:pPr>
+        <w:spacing w:before="80" w:after="80"/>
+        <w:ind w:left="567"/>
+      </w:pPr>
+      <w:r>
+        <w:rPr>
+          <w:rFonts w:ascii="Consolas" w:hAnsi="Consolas"/>
+          <w:color w:val="006400"/>
+          <w:sz w:val="20"/>
+        </w:rPr>
+        <w:t>https://nodejs.org</w:t>
+      </w:r>
+    </w:p>
+    <w:p>
+      <w:r>
+        <w:t>"LTS"라고 적힌 큰 초록색 버튼을 클릭하세요.</w:t>
+      </w:r>
+    </w:p>
+    <w:p>
+      <w:r>
+        <w:t>&gt;&gt; LTS = "Long Term Support" = "오래오래 안정적으로 쓸 수 있는 버전". 항상 이걸 선택!</w:t>
+      </w:r>
+    </w:p>
+    <w:p/>
+    <w:p>
+      <w:r>
+        <w:t>다운로드된 파일(node-v숫자-x64.msi)을 더블클릭하세요.</w:t>
+      </w:r>
+    </w:p>
+    <w:p>
+      <w:r>
+        <w:t>"Next -&gt; Next -&gt; ... -&gt; Install -&gt; Finish" 순서로 설치!</w:t>
+      </w:r>
+    </w:p>
+    <w:p/>
+    <w:p>
+      <w:r>
+        <w:t>!! 중요: 설치 후 Git Bash를 껐다가 다시 열어야 합니다!</w:t>
+      </w:r>
+    </w:p>
+    <w:p>
+      <w:r>
+        <w:t>Git Bash를 새로 열고 확인:</w:t>
+      </w:r>
+    </w:p>
+    <w:p>
+      <w:pPr>
+        <w:spacing w:before="80" w:after="80"/>
+        <w:ind w:left="567"/>
+      </w:pPr>
+      <w:r>
+        <w:rPr>
+          <w:rFonts w:ascii="Consolas" w:hAnsi="Consolas"/>
+          <w:color w:val="006400"/>
+          <w:sz w:val="20"/>
+        </w:rPr>
+        <w:t>node --version</w:t>
+      </w:r>
+    </w:p>
+    <w:p>
+      <w:r>
+        <w:t>v로 시작하는 숫자가 나오면 성공! (예: v22.13.1)</w:t>
+      </w:r>
+    </w:p>
+    <w:p/>
+    <w:p>
+      <w:pPr>
+        <w:pStyle w:val="Heading2"/>
+      </w:pPr>
+      <w:r>
+        <w:rPr>
+          <w:rFonts w:ascii="맑은 고딕" w:hAnsi="맑은 고딕" w:eastAsia="맑은 고딕"/>
+        </w:rPr>
+        <w:t>Step 8. Claude Code 설치 + 첫 실행! (8분)</w:t>
+      </w:r>
+    </w:p>
+    <w:p>
+      <w:r>
+        <w:t>&gt;&gt; Claude Code가 뭔가요?</w:t>
+      </w:r>
+    </w:p>
+    <w:p>
+      <w:r>
+        <w:t>터미널 안에서 동작하는 AI 비서예요.</w:t>
+      </w:r>
+    </w:p>
+    <w:p>
+      <w:r>
+        <w:t>비유: 카카오톡으로 똑똑한 친구에게 "이거 만들어줘"라고 부탁하는 것처럼,</w:t>
+      </w:r>
+    </w:p>
+    <w:p>
+      <w:r>
+        <w:t>터미널에서 Claude에게 프로그램을 만들어달라고 부탁할 수 있어요.</w:t>
+      </w:r>
+    </w:p>
+    <w:p/>
+    <w:p>
+      <w:r>
+        <w:t>Git Bash에서 아래 명령어를 입력하세요:</w:t>
+      </w:r>
+    </w:p>
+    <w:p>
+      <w:pPr>
+        <w:spacing w:before="80" w:after="80"/>
+        <w:ind w:left="567"/>
+      </w:pPr>
+      <w:r>
+        <w:rPr>
+          <w:rFonts w:ascii="Consolas" w:hAnsi="Consolas"/>
+          <w:color w:val="006400"/>
+          <w:sz w:val="20"/>
+        </w:rPr>
+        <w:t>npm install -g @anthropic-ai/claude-code</w:t>
+      </w:r>
+    </w:p>
+    <w:p>
+      <w:r>
+        <w:t>&gt;&gt; npm install = "설치해줘", -g = "어디서든 쓸 수 있게"</w:t>
+      </w:r>
+    </w:p>
+    <w:p>
+      <w:r>
+        <w:t>설치에 1~3분 걸려요. "added XX packages"가 보이면 성공!</w:t>
+      </w:r>
+    </w:p>
+    <w:p/>
+    <w:p>
+      <w:r>
+        <w:t>프로젝트 폴더로 이동하고 Claude를 실행합시다:</w:t>
+      </w:r>
+    </w:p>
+    <w:p>
+      <w:pPr>
+        <w:spacing w:before="80" w:after="80"/>
+        <w:ind w:left="567"/>
+      </w:pPr>
+      <w:r>
+        <w:rPr>
+          <w:rFonts w:ascii="Consolas" w:hAnsi="Consolas"/>
+          <w:color w:val="006400"/>
+          <w:sz w:val="20"/>
+        </w:rPr>
+        <w:t>cd ~/etf-dashboard</w:t>
+        <w:br/>
+        <w:t>claude</w:t>
+      </w:r>
+    </w:p>
+    <w:p/>
+    <w:p>
+      <w:r>
+        <w:t>처음 실행하면 로그인이 필요합니다. 화면에 이런 메시지가 나타나요:</w:t>
+      </w:r>
+    </w:p>
+    <w:p>
+      <w:pPr>
+        <w:spacing w:before="80" w:after="80"/>
+        <w:ind w:left="567"/>
+      </w:pPr>
+      <w:r>
+        <w:rPr>
+          <w:rFonts w:ascii="Consolas" w:hAnsi="Consolas"/>
+          <w:color w:val="006400"/>
+          <w:sz w:val="20"/>
+        </w:rPr>
+        <w:t>? How would you like to authenticate? (Use arrow keys)</w:t>
+        <w:br/>
+        <w:t>&gt; Anthropic Console (OAuth - recommended)</w:t>
+        <w:br/>
+        <w:t xml:space="preserve">  API Key</w:t>
+      </w:r>
+    </w:p>
+    <w:p/>
+    <w:p>
+      <w:r>
+        <w:t>키보드 화살표로 "Anthropic Console"이 선택된 상태에서 Enter를 누르세요.</w:t>
+      </w:r>
+    </w:p>
+    <w:p>
+      <w:r>
+        <w:t>브라우저가 자동으로 열려요.</w:t>
+      </w:r>
+    </w:p>
+    <w:p/>
+    <w:p>
+      <w:r>
+        <w:t>브라우저에서:</w:t>
+      </w:r>
+    </w:p>
+    <w:p>
+      <w:r>
+        <w:t xml:space="preserve">  - 계정이 있다면: 로그인</w:t>
+      </w:r>
+    </w:p>
+    <w:p>
+      <w:r>
+        <w:t xml:space="preserve">  - 계정이 없다면: "Sign up" 클릭 -&gt; 구글 계정으로 간편 가입 가능!</w:t>
+      </w:r>
+    </w:p>
+    <w:p>
+      <w:r>
+        <w:t xml:space="preserve">  - 로그인 후 "Allow" 또는 "허용" 클릭</w:t>
+      </w:r>
+    </w:p>
+    <w:p/>
+    <w:p>
+      <w:r>
+        <w:t>터미널에 이런 화면이 보이면 성공:</w:t>
+      </w:r>
+    </w:p>
+    <w:p>
+      <w:pPr>
+        <w:spacing w:before="80" w:after="80"/>
+        <w:ind w:left="567"/>
+      </w:pPr>
+      <w:r>
+        <w:rPr>
+          <w:rFonts w:ascii="Consolas" w:hAnsi="Consolas"/>
+          <w:color w:val="006400"/>
+          <w:sz w:val="20"/>
+        </w:rPr>
+        <w:t>&gt; Welcome to Claude Code!</w:t>
+        <w:br/>
+        <w:br/>
+        <w:t>&gt;</w:t>
+      </w:r>
+    </w:p>
+    <w:p/>
+    <w:p>
+      <w:pPr>
+        <w:pStyle w:val="Heading2"/>
+      </w:pPr>
+      <w:r>
+        <w:rPr>
+          <w:rFonts w:ascii="맑은 고딕" w:hAnsi="맑은 고딕" w:eastAsia="맑은 고딕"/>
+        </w:rPr>
+        <w:t>Step 9. Claude에게 첫 인사하기! (3분)</w:t>
+      </w:r>
+    </w:p>
+    <w:p>
+      <w:r>
+        <w:t>&gt; 표시 옆에 아래처럼 입력하고 Enter:</w:t>
+      </w:r>
+    </w:p>
+    <w:p>
+      <w:pPr>
+        <w:spacing w:before="80" w:after="80"/>
+        <w:ind w:left="567"/>
+      </w:pPr>
+      <w:r>
+        <w:rPr>
+          <w:rFonts w:ascii="Consolas" w:hAnsi="Consolas"/>
+          <w:color w:val="006400"/>
+          <w:sz w:val="20"/>
+        </w:rPr>
+        <w:t>안녕! 나는 ETF 대시보드를 만들고 싶어. 도와줄 수 있어?</w:t>
+      </w:r>
+    </w:p>
+    <w:p>
+      <w:r>
+        <w:t>Claude가 한국어로 친절하게 대답해줄 거예요!</w:t>
+      </w:r>
+    </w:p>
+    <w:p/>
+    <w:p>
+      <w:r>
+        <w:t>축하해요! 오늘 한 번에 터미널, Git, Node.js, AI 비서까지 만났습니다!</w:t>
+      </w:r>
+    </w:p>
+    <w:p/>
+    <w:p>
+      <w:r>
+        <w:t>TIP: Claude Code를 끝내려면 Ctrl+C 또는 /exit 입력</w:t>
+      </w:r>
+    </w:p>
+    <w:p/>
+    <w:p>
+      <w:pPr>
+        <w:pStyle w:val="Heading2"/>
+      </w:pPr>
+      <w:r>
+        <w:rPr>
+          <w:rFonts w:ascii="맑은 고딕" w:hAnsi="맑은 고딕" w:eastAsia="맑은 고딕"/>
+        </w:rPr>
         <w:t>CHECK 체크포인트</w:t>
       </w:r>
     </w:p>
@@ -990,6 +1304,33 @@
           <w:color w:val="008000"/>
         </w:rPr>
         <w:t>CHECK: git --version을 쳤을 때 숫자가 나왔나요?</w:t>
+      </w:r>
+    </w:p>
+    <w:p>
+      <w:r>
+        <w:rPr>
+          <w:rFonts w:ascii="맑은 고딕" w:hAnsi="맑은 고딕" w:eastAsia="맑은 고딕"/>
+          <w:color w:val="008000"/>
+        </w:rPr>
+        <w:t>CHECK: node --version을 쳤을 때 숫자가 나왔나요?</w:t>
+      </w:r>
+    </w:p>
+    <w:p>
+      <w:r>
+        <w:rPr>
+          <w:rFonts w:ascii="맑은 고딕" w:hAnsi="맑은 고딕" w:eastAsia="맑은 고딕"/>
+          <w:color w:val="008000"/>
+        </w:rPr>
+        <w:t>CHECK: Claude Code에서 "Welcome to Claude Code" 화면이 나왔나요?</w:t>
+      </w:r>
+    </w:p>
+    <w:p>
+      <w:r>
+        <w:rPr>
+          <w:rFonts w:ascii="맑은 고딕" w:hAnsi="맑은 고딕" w:eastAsia="맑은 고딕"/>
+          <w:color w:val="008000"/>
+        </w:rPr>
+        <w:t>CHECK: Claude에게 메시지를 보내고 답변을 받았나요?</w:t>
       </w:r>
     </w:p>
     <w:p/>
@@ -1185,551 +1526,6 @@
           </w:p>
         </w:tc>
       </w:tr>
-    </w:tbl>
-    <w:p/>
-    <w:p>
-      <w:r>
-        <w:rPr>
-          <w:rFonts w:ascii="맑은 고딕" w:hAnsi="맑은 고딕" w:eastAsia="맑은 고딕"/>
-          <w:b/>
-          <w:color w:val="008000"/>
-          <w:sz w:val="24"/>
-        </w:rPr>
-        <w:t>1회차 완료! 수고하셨습니다!</w:t>
-      </w:r>
-    </w:p>
-    <w:p>
-      <w:r>
-        <w:rPr>
-          <w:rFonts w:ascii="맑은 고딕" w:hAnsi="맑은 고딕" w:eastAsia="맑은 고딕"/>
-          <w:i/>
-        </w:rPr>
-        <w:t>다음 회차에서 프로그래밍 도구를 설치하고 AI 비서를 만나볼 거예요.</w:t>
-      </w:r>
-    </w:p>
-    <w:p>
-      <w:r>
-        <w:br w:type="page"/>
-      </w:r>
-    </w:p>
-    <w:p>
-      <w:pPr>
-        <w:pStyle w:val="Heading1"/>
-      </w:pPr>
-      <w:r>
-        <w:rPr>
-          <w:rFonts w:ascii="맑은 고딕" w:hAnsi="맑은 고딕" w:eastAsia="맑은 고딕"/>
-        </w:rPr>
-        <w:t>2회차: 프로그래밍 도구 설치 - Node.js와 Python</w:t>
-      </w:r>
-    </w:p>
-    <w:p>
-      <w:r>
-        <w:rPr>
-          <w:rFonts w:ascii="맑은 고딕" w:hAnsi="맑은 고딕" w:eastAsia="맑은 고딕"/>
-          <w:b/>
-          <w:color w:val="0064C8"/>
-        </w:rPr>
-        <w:t>소요 시간: 30분</w:t>
-      </w:r>
-    </w:p>
-    <w:p>
-      <w:r>
-        <w:rPr>
-          <w:rFonts w:ascii="맑은 고딕" w:hAnsi="맑은 고딕" w:eastAsia="맑은 고딕"/>
-          <w:b/>
-        </w:rPr>
-        <w:t>이 회차를 마치면: Claude Code를 설치하기 위한 준비가 완료! node, npm, python 명령어가 터미널에서 작동해요.</w:t>
-      </w:r>
-    </w:p>
-    <w:p/>
-    <w:p>
-      <w:pPr>
-        <w:pStyle w:val="Heading2"/>
-      </w:pPr>
-      <w:r>
-        <w:rPr>
-          <w:rFonts w:ascii="맑은 고딕" w:hAnsi="맑은 고딕" w:eastAsia="맑은 고딕"/>
-        </w:rPr>
-        <w:t>Step 1. Node.js 다운로드 및 설치 (10분)</w:t>
-      </w:r>
-    </w:p>
-    <w:p>
-      <w:r>
-        <w:t>&gt;&gt; Node.js(노드제이에스)가 뭔가요?</w:t>
-      </w:r>
-    </w:p>
-    <w:p>
-      <w:r>
-        <w:t>프로그램을 실행시켜주는 "엔진"이에요.</w:t>
-      </w:r>
-    </w:p>
-    <w:p>
-      <w:r>
-        <w:t>비유: 자동차(프로그램)가 달리려면 엔진(Node.js)이 필요한 것처럼,</w:t>
-      </w:r>
-    </w:p>
-    <w:p>
-      <w:r>
-        <w:t>Claude Code를 돌리려면 Node.js가 필요해요.</w:t>
-      </w:r>
-    </w:p>
-    <w:p/>
-    <w:p>
-      <w:r>
-        <w:t>브라우저에서 아래 주소로 이동하세요:</w:t>
-      </w:r>
-    </w:p>
-    <w:p>
-      <w:pPr>
-        <w:spacing w:before="80" w:after="80"/>
-        <w:ind w:left="567"/>
-      </w:pPr>
-      <w:r>
-        <w:rPr>
-          <w:rFonts w:ascii="Consolas" w:hAnsi="Consolas"/>
-          <w:color w:val="006400"/>
-          <w:sz w:val="20"/>
-        </w:rPr>
-        <w:t>https://nodejs.org</w:t>
-      </w:r>
-    </w:p>
-    <w:p>
-      <w:r>
-        <w:t>"LTS"라고 적힌 큰 초록색 버튼을 클릭하세요.</w:t>
-      </w:r>
-    </w:p>
-    <w:p>
-      <w:r>
-        <w:t>&gt;&gt; LTS = "Long Term Support" = "오래오래 안정적으로 쓸 수 있는 버전"</w:t>
-      </w:r>
-    </w:p>
-    <w:p>
-      <w:r>
-        <w:t>&gt;&gt; 항상 이걸 선택하면 안전해요!</w:t>
-      </w:r>
-    </w:p>
-    <w:p/>
-    <w:p>
-      <w:r>
-        <w:t>다운로드된 파일(node-v숫자-x64.msi)을 더블클릭하세요.</w:t>
-      </w:r>
-    </w:p>
-    <w:p>
-      <w:r>
-        <w:t>설치 화면이 나오면:</w:t>
-      </w:r>
-    </w:p>
-    <w:p>
-      <w:r>
-        <w:t xml:space="preserve">  1) "Next" 버튼을 계속 누르세요 (4~5번)</w:t>
-      </w:r>
-    </w:p>
-    <w:p>
-      <w:r>
-        <w:t xml:space="preserve">  2) "I accept the terms..." 체크박스 보이면 체크하고 "Next"</w:t>
-      </w:r>
-    </w:p>
-    <w:p>
-      <w:r>
-        <w:t xml:space="preserve">  3) 마지막에 "Install" 버튼 클릭</w:t>
-      </w:r>
-    </w:p>
-    <w:p>
-      <w:r>
-        <w:t xml:space="preserve">  4) "이 앱이 변경하도록 허용합니다" -&gt; "예"</w:t>
-      </w:r>
-    </w:p>
-    <w:p>
-      <w:r>
-        <w:t xml:space="preserve">  5) "Finish" 클릭</w:t>
-      </w:r>
-    </w:p>
-    <w:p/>
-    <w:p>
-      <w:r>
-        <w:t>TIP: "Next -&gt; Next -&gt; Install -&gt; Finish" 이 순서만 기억하면 돼요!</w:t>
-      </w:r>
-    </w:p>
-    <w:p/>
-    <w:p>
-      <w:pPr>
-        <w:pStyle w:val="Heading2"/>
-      </w:pPr>
-      <w:r>
-        <w:rPr>
-          <w:rFonts w:ascii="맑은 고딕" w:hAnsi="맑은 고딕" w:eastAsia="맑은 고딕"/>
-        </w:rPr>
-        <w:t>Step 2. Node.js 설치 확인 (5분)</w:t>
-      </w:r>
-    </w:p>
-    <w:p>
-      <w:r>
-        <w:t>!! 중요: Git Bash를 껐다가 다시 열어야 합니다!</w:t>
-      </w:r>
-    </w:p>
-    <w:p>
-      <w:r>
-        <w:t>(새로 설치한 프로그램을 인식하려면 터미널을 새로 열어야 해요)</w:t>
-      </w:r>
-    </w:p>
-    <w:p/>
-    <w:p>
-      <w:r>
-        <w:t>Git Bash를 새로 열고 아래 명령어를 입력하세요:</w:t>
-      </w:r>
-    </w:p>
-    <w:p>
-      <w:pPr>
-        <w:spacing w:before="80" w:after="80"/>
-        <w:ind w:left="567"/>
-      </w:pPr>
-      <w:r>
-        <w:rPr>
-          <w:rFonts w:ascii="Consolas" w:hAnsi="Consolas"/>
-          <w:color w:val="006400"/>
-          <w:sz w:val="20"/>
-        </w:rPr>
-        <w:t>node --version</w:t>
-      </w:r>
-    </w:p>
-    <w:p>
-      <w:r>
-        <w:t>이런 숫자가 나오면 성공:</w:t>
-      </w:r>
-    </w:p>
-    <w:p>
-      <w:pPr>
-        <w:spacing w:before="80" w:after="80"/>
-        <w:ind w:left="567"/>
-      </w:pPr>
-      <w:r>
-        <w:rPr>
-          <w:rFonts w:ascii="Consolas" w:hAnsi="Consolas"/>
-          <w:color w:val="006400"/>
-          <w:sz w:val="20"/>
-        </w:rPr>
-        <w:t>v22.13.1</w:t>
-      </w:r>
-    </w:p>
-    <w:p>
-      <w:r>
-        <w:t>(숫자는 달라도 OK!)</w:t>
-      </w:r>
-    </w:p>
-    <w:p/>
-    <w:p>
-      <w:r>
-        <w:t>이어서 아래도 입력해보세요:</w:t>
-      </w:r>
-    </w:p>
-    <w:p>
-      <w:pPr>
-        <w:spacing w:before="80" w:after="80"/>
-        <w:ind w:left="567"/>
-      </w:pPr>
-      <w:r>
-        <w:rPr>
-          <w:rFonts w:ascii="Consolas" w:hAnsi="Consolas"/>
-          <w:color w:val="006400"/>
-          <w:sz w:val="20"/>
-        </w:rPr>
-        <w:t>npm --version</w:t>
-      </w:r>
-    </w:p>
-    <w:p>
-      <w:r>
-        <w:t>&gt;&gt; npm = "Node Package Manager" = 앱스토어처럼 필요한 프로그램을 설치하는 도구</w:t>
-      </w:r>
-    </w:p>
-    <w:p>
-      <w:r>
-        <w:t>숫자가 나오면 성공!</w:t>
-      </w:r>
-    </w:p>
-    <w:p/>
-    <w:p>
-      <w:pPr>
-        <w:pStyle w:val="Heading2"/>
-      </w:pPr>
-      <w:r>
-        <w:rPr>
-          <w:rFonts w:ascii="맑은 고딕" w:hAnsi="맑은 고딕" w:eastAsia="맑은 고딕"/>
-        </w:rPr>
-        <w:t>Step 3. Python 다운로드 및 설치 (10분)</w:t>
-      </w:r>
-    </w:p>
-    <w:p>
-      <w:r>
-        <w:t>&gt;&gt; Python(파이썬)이 뭔가요?</w:t>
-      </w:r>
-    </w:p>
-    <w:p>
-      <w:r>
-        <w:t>컴퓨터 프로그래밍 언어예요. 영어처럼 읽기 쉬워서 초보자에게 인기가 많아요.</w:t>
-      </w:r>
-    </w:p>
-    <w:p>
-      <w:r>
-        <w:t>우리는 데이터를 수집할 때 Python을 사용할 거예요.</w:t>
-      </w:r>
-    </w:p>
-    <w:p/>
-    <w:p>
-      <w:r>
-        <w:t>브라우저에서 아래 주소로 이동하세요:</w:t>
-      </w:r>
-    </w:p>
-    <w:p>
-      <w:pPr>
-        <w:spacing w:before="80" w:after="80"/>
-        <w:ind w:left="567"/>
-      </w:pPr>
-      <w:r>
-        <w:rPr>
-          <w:rFonts w:ascii="Consolas" w:hAnsi="Consolas"/>
-          <w:color w:val="006400"/>
-          <w:sz w:val="20"/>
-        </w:rPr>
-        <w:t>https://www.python.org/downloads/</w:t>
-      </w:r>
-    </w:p>
-    <w:p>
-      <w:r>
-        <w:t>노란색 "Download Python 3.x.x" 버튼을 클릭하세요.</w:t>
-      </w:r>
-    </w:p>
-    <w:p/>
-    <w:p>
-      <w:r>
-        <w:t>다운로드된 파일을 실행하면 설치 화면이 나옵니다.</w:t>
-      </w:r>
-    </w:p>
-    <w:p/>
-    <w:p>
-      <w:r>
-        <w:t>!! 가장 중요한 순간!</w:t>
-      </w:r>
-    </w:p>
-    <w:p>
-      <w:r>
-        <w:t>!! 맨 아래에 "Add python.exe to PATH"라는 체크박스가 보입니다.</w:t>
-      </w:r>
-    </w:p>
-    <w:p>
-      <w:r>
-        <w:t>!! 이것을 반.드.시. 체크하세요!</w:t>
-      </w:r>
-    </w:p>
-    <w:p>
-      <w:r>
-        <w:t>!! (체크 안 하면 나중에 python 명령어가 안 먹어서 큰 문제가 생겨요)</w:t>
-      </w:r>
-    </w:p>
-    <w:p/>
-    <w:p>
-      <w:r>
-        <w:t>체크한 후 "Install Now"를 클릭하세요.</w:t>
-      </w:r>
-    </w:p>
-    <w:p>
-      <w:r>
-        <w:t>설치가 끝나면 "Close"를 누르세요.</w:t>
-      </w:r>
-    </w:p>
-    <w:p/>
-    <w:p>
-      <w:pPr>
-        <w:pStyle w:val="Heading2"/>
-      </w:pPr>
-      <w:r>
-        <w:rPr>
-          <w:rFonts w:ascii="맑은 고딕" w:hAnsi="맑은 고딕" w:eastAsia="맑은 고딕"/>
-        </w:rPr>
-        <w:t>Step 4. Python 설치 확인 (5분)</w:t>
-      </w:r>
-    </w:p>
-    <w:p>
-      <w:r>
-        <w:t>Git Bash를 껐다가 다시 열고:</w:t>
-      </w:r>
-    </w:p>
-    <w:p>
-      <w:pPr>
-        <w:spacing w:before="80" w:after="80"/>
-        <w:ind w:left="567"/>
-      </w:pPr>
-      <w:r>
-        <w:rPr>
-          <w:rFonts w:ascii="Consolas" w:hAnsi="Consolas"/>
-          <w:color w:val="006400"/>
-          <w:sz w:val="20"/>
-        </w:rPr>
-        <w:t>python --version</w:t>
-      </w:r>
-    </w:p>
-    <w:p>
-      <w:r>
-        <w:t>이런 결과가 나오면 성공:</w:t>
-      </w:r>
-    </w:p>
-    <w:p>
-      <w:pPr>
-        <w:spacing w:before="80" w:after="80"/>
-        <w:ind w:left="567"/>
-      </w:pPr>
-      <w:r>
-        <w:rPr>
-          <w:rFonts w:ascii="Consolas" w:hAnsi="Consolas"/>
-          <w:color w:val="006400"/>
-          <w:sz w:val="20"/>
-        </w:rPr>
-        <w:t>Python 3.13.1</w:t>
-      </w:r>
-    </w:p>
-    <w:p/>
-    <w:p>
-      <w:r>
-        <w:t>pip도 확인해볼까요?</w:t>
-      </w:r>
-    </w:p>
-    <w:p>
-      <w:pPr>
-        <w:spacing w:before="80" w:after="80"/>
-        <w:ind w:left="567"/>
-      </w:pPr>
-      <w:r>
-        <w:rPr>
-          <w:rFonts w:ascii="Consolas" w:hAnsi="Consolas"/>
-          <w:color w:val="006400"/>
-          <w:sz w:val="20"/>
-        </w:rPr>
-        <w:t>pip --version</w:t>
-      </w:r>
-    </w:p>
-    <w:p>
-      <w:r>
-        <w:t>&gt;&gt; pip = Python의 앱스토어. Python 프로그램에 필요한 재료를 설치하는 도구</w:t>
-      </w:r>
-    </w:p>
-    <w:p>
-      <w:r>
-        <w:t>숫자가 나오면 성공!</w:t>
-      </w:r>
-    </w:p>
-    <w:p/>
-    <w:p>
-      <w:pPr>
-        <w:pStyle w:val="Heading2"/>
-      </w:pPr>
-      <w:r>
-        <w:rPr>
-          <w:rFonts w:ascii="맑은 고딕" w:hAnsi="맑은 고딕" w:eastAsia="맑은 고딕"/>
-        </w:rPr>
-        <w:t>CHECK 체크포인트</w:t>
-      </w:r>
-    </w:p>
-    <w:p>
-      <w:r>
-        <w:rPr>
-          <w:rFonts w:ascii="맑은 고딕" w:hAnsi="맑은 고딕" w:eastAsia="맑은 고딕"/>
-          <w:color w:val="008000"/>
-        </w:rPr>
-        <w:t>CHECK: node --version 결과에 v로 시작하는 숫자가 나왔나요?</w:t>
-      </w:r>
-    </w:p>
-    <w:p>
-      <w:r>
-        <w:rPr>
-          <w:rFonts w:ascii="맑은 고딕" w:hAnsi="맑은 고딕" w:eastAsia="맑은 고딕"/>
-          <w:color w:val="008000"/>
-        </w:rPr>
-        <w:t>CHECK: npm --version 결과에 숫자가 나왔나요?</w:t>
-      </w:r>
-    </w:p>
-    <w:p>
-      <w:r>
-        <w:rPr>
-          <w:rFonts w:ascii="맑은 고딕" w:hAnsi="맑은 고딕" w:eastAsia="맑은 고딕"/>
-          <w:color w:val="008000"/>
-        </w:rPr>
-        <w:t>CHECK: python --version 결과에 Python 3.x.x가 나왔나요?</w:t>
-      </w:r>
-    </w:p>
-    <w:p>
-      <w:r>
-        <w:rPr>
-          <w:rFonts w:ascii="맑은 고딕" w:hAnsi="맑은 고딕" w:eastAsia="맑은 고딕"/>
-          <w:color w:val="008000"/>
-        </w:rPr>
-        <w:t>CHECK: pip --version 결과에 숫자가 나왔나요?</w:t>
-      </w:r>
-    </w:p>
-    <w:p/>
-    <w:p>
-      <w:pPr>
-        <w:pStyle w:val="Heading2"/>
-      </w:pPr>
-      <w:r>
-        <w:rPr>
-          <w:rFonts w:ascii="맑은 고딕" w:hAnsi="맑은 고딕" w:eastAsia="맑은 고딕"/>
-        </w:rPr>
-        <w:t>!! 막혔을 때</w:t>
-      </w:r>
-    </w:p>
-    <w:tbl>
-      <w:tblPr>
-        <w:tblStyle w:val="LightGrid-Accent1"/>
-        <w:tblW w:type="auto" w:w="0"/>
-        <w:jc w:val="center"/>
-        <w:tblLook w:firstColumn="1" w:firstRow="1" w:lastColumn="0" w:lastRow="0" w:noHBand="0" w:noVBand="1" w:val="04A0"/>
-      </w:tblPr>
-      <w:tblGrid>
-        <w:gridCol w:w="2880"/>
-        <w:gridCol w:w="2880"/>
-        <w:gridCol w:w="2880"/>
-      </w:tblGrid>
-      <w:tr>
-        <w:tc>
-          <w:tcPr>
-            <w:tcW w:type="dxa" w:w="2880"/>
-          </w:tcPr>
-          <w:p>
-            <w:r>
-              <w:rPr>
-                <w:b/>
-              </w:rPr>
-              <w:t>증상</w:t>
-            </w:r>
-          </w:p>
-        </w:tc>
-        <w:tc>
-          <w:tcPr>
-            <w:tcW w:type="dxa" w:w="2880"/>
-          </w:tcPr>
-          <w:p>
-            <w:r>
-              <w:rPr>
-                <w:b/>
-              </w:rPr>
-              <w:t>원인</w:t>
-            </w:r>
-          </w:p>
-        </w:tc>
-        <w:tc>
-          <w:tcPr>
-            <w:tcW w:type="dxa" w:w="2880"/>
-          </w:tcPr>
-          <w:p>
-            <w:r>
-              <w:rPr>
-                <w:b/>
-              </w:rPr>
-              <w:t>해결법</w:t>
-            </w:r>
-          </w:p>
-        </w:tc>
-      </w:tr>
       <w:tr>
         <w:tc>
           <w:tcPr>
@@ -1757,608 +1553,7 @@
           </w:tcPr>
           <w:p>
             <w:r>
-              <w:t>Git Bash를 완전히 닫고 새로 여세요. 그래도 안 되면 Node.js 다시 설치</w:t>
-            </w:r>
-          </w:p>
-        </w:tc>
-      </w:tr>
-      <w:tr>
-        <w:tc>
-          <w:tcPr>
-            <w:tcW w:type="dxa" w:w="2880"/>
-          </w:tcPr>
-          <w:p>
-            <w:r>
-              <w:t>python 대신 Microsoft Store가 열려요</w:t>
-            </w:r>
-          </w:p>
-        </w:tc>
-        <w:tc>
-          <w:tcPr>
-            <w:tcW w:type="dxa" w:w="2880"/>
-          </w:tcPr>
-          <w:p>
-            <w:r>
-              <w:t>Windows 앱 별칭 문제</w:t>
-            </w:r>
-          </w:p>
-        </w:tc>
-        <w:tc>
-          <w:tcPr>
-            <w:tcW w:type="dxa" w:w="2880"/>
-          </w:tcPr>
-          <w:p>
-            <w:r>
-              <w:t>Git Bash에서는 보통 안 생겨요. 생기면 python3으로 시도</w:t>
-            </w:r>
-          </w:p>
-        </w:tc>
-      </w:tr>
-      <w:tr>
-        <w:tc>
-          <w:tcPr>
-            <w:tcW w:type="dxa" w:w="2880"/>
-          </w:tcPr>
-          <w:p>
-            <w:r>
-              <w:t>설치 중 "관리자 권한" 에러</w:t>
-            </w:r>
-          </w:p>
-        </w:tc>
-        <w:tc>
-          <w:tcPr>
-            <w:tcW w:type="dxa" w:w="2880"/>
-          </w:tcPr>
-          <w:p>
-            <w:r>
-              <w:t>권한 부족</w:t>
-            </w:r>
-          </w:p>
-        </w:tc>
-        <w:tc>
-          <w:tcPr>
-            <w:tcW w:type="dxa" w:w="2880"/>
-          </w:tcPr>
-          <w:p>
-            <w:r>
-              <w:t>설치 파일 -&gt; 마우스 우클릭 -&gt; "관리자 권한으로 실행"</w:t>
-            </w:r>
-          </w:p>
-        </w:tc>
-      </w:tr>
-      <w:tr>
-        <w:tc>
-          <w:tcPr>
-            <w:tcW w:type="dxa" w:w="2880"/>
-          </w:tcPr>
-          <w:p>
-            <w:r>
-              <w:t>어떤 버전을 받아야 할지 모르겠어요</w:t>
-            </w:r>
-          </w:p>
-        </w:tc>
-        <w:tc>
-          <w:tcPr>
-            <w:tcW w:type="dxa" w:w="2880"/>
-          </w:tcPr>
-          <w:p>
-            <w:r>
-              <w:t>여러 버전이 보여서 헷갈림</w:t>
-            </w:r>
-          </w:p>
-        </w:tc>
-        <w:tc>
-          <w:tcPr>
-            <w:tcW w:type="dxa" w:w="2880"/>
-          </w:tcPr>
-          <w:p>
-            <w:r>
-              <w:t>항상 "LTS" 또는 가장 위에 있는 큰 버튼을 누르세요</w:t>
-            </w:r>
-          </w:p>
-        </w:tc>
-      </w:tr>
-    </w:tbl>
-    <w:p/>
-    <w:p>
-      <w:r>
-        <w:rPr>
-          <w:rFonts w:ascii="맑은 고딕" w:hAnsi="맑은 고딕" w:eastAsia="맑은 고딕"/>
-          <w:b/>
-          <w:color w:val="008000"/>
-          <w:sz w:val="24"/>
-        </w:rPr>
-        <w:t>2회차 완료! 수고하셨습니다!</w:t>
-      </w:r>
-    </w:p>
-    <w:p>
-      <w:r>
-        <w:rPr>
-          <w:rFonts w:ascii="맑은 고딕" w:hAnsi="맑은 고딕" w:eastAsia="맑은 고딕"/>
-          <w:i/>
-        </w:rPr>
-        <w:t>다음 회차에서 드디어 AI 비서 Claude Code를 설치해요!</w:t>
-      </w:r>
-    </w:p>
-    <w:p>
-      <w:r>
-        <w:br w:type="page"/>
-      </w:r>
-    </w:p>
-    <w:p>
-      <w:pPr>
-        <w:pStyle w:val="Heading1"/>
-      </w:pPr>
-      <w:r>
-        <w:rPr>
-          <w:rFonts w:ascii="맑은 고딕" w:hAnsi="맑은 고딕" w:eastAsia="맑은 고딕"/>
-        </w:rPr>
-        <w:t>3회차: Claude Code 설치 및 첫 실행 - AI 비서를 만나다!</w:t>
-      </w:r>
-    </w:p>
-    <w:p>
-      <w:r>
-        <w:rPr>
-          <w:rFonts w:ascii="맑은 고딕" w:hAnsi="맑은 고딕" w:eastAsia="맑은 고딕"/>
-          <w:b/>
-          <w:color w:val="0064C8"/>
-        </w:rPr>
-        <w:t>소요 시간: 30분</w:t>
-      </w:r>
-    </w:p>
-    <w:p>
-      <w:r>
-        <w:rPr>
-          <w:rFonts w:ascii="맑은 고딕" w:hAnsi="맑은 고딕" w:eastAsia="맑은 고딕"/>
-          <w:b/>
-        </w:rPr>
-        <w:t>이 회차를 마치면: AI 비서(Claude Code)와 터미널에서 대화할 수 있어요! "이거 만들어줘"라고 부탁할 준비 완료!</w:t>
-      </w:r>
-    </w:p>
-    <w:p/>
-    <w:p>
-      <w:pPr>
-        <w:pStyle w:val="Heading2"/>
-      </w:pPr>
-      <w:r>
-        <w:rPr>
-          <w:rFonts w:ascii="맑은 고딕" w:hAnsi="맑은 고딕" w:eastAsia="맑은 고딕"/>
-        </w:rPr>
-        <w:t>Step 1. Claude Code 설치 (5분)</w:t>
-      </w:r>
-    </w:p>
-    <w:p>
-      <w:r>
-        <w:t>&gt;&gt; Claude Code가 뭔가요?</w:t>
-      </w:r>
-    </w:p>
-    <w:p>
-      <w:r>
-        <w:t>터미널 안에서 동작하는 AI 비서예요.</w:t>
-      </w:r>
-    </w:p>
-    <w:p>
-      <w:r>
-        <w:t>비유: 카카오톡으로 똑똑한 친구에게 "이거 만들어줘"라고 부탁하는 것처럼,</w:t>
-      </w:r>
-    </w:p>
-    <w:p>
-      <w:r>
-        <w:t>터미널에서 Claude에게 프로그램을 만들어달라고 부탁할 수 있어요.</w:t>
-      </w:r>
-    </w:p>
-    <w:p/>
-    <w:p>
-      <w:r>
-        <w:t>Git Bash를 열고 아래 명령어를 입력하세요:</w:t>
-      </w:r>
-    </w:p>
-    <w:p>
-      <w:pPr>
-        <w:spacing w:before="80" w:after="80"/>
-        <w:ind w:left="567"/>
-      </w:pPr>
-      <w:r>
-        <w:rPr>
-          <w:rFonts w:ascii="Consolas" w:hAnsi="Consolas"/>
-          <w:color w:val="006400"/>
-          <w:sz w:val="20"/>
-        </w:rPr>
-        <w:t>npm install -g @anthropic-ai/claude-code</w:t>
-      </w:r>
-    </w:p>
-    <w:p>
-      <w:r>
-        <w:t>&gt;&gt; 이 명령어의 뜻:</w:t>
-      </w:r>
-    </w:p>
-    <w:p>
-      <w:r>
-        <w:t xml:space="preserve">   npm install = "이 프로그램을 설치해줘"</w:t>
-      </w:r>
-    </w:p>
-    <w:p>
-      <w:r>
-        <w:t xml:space="preserve">   -g = "어디서든 쓸 수 있게" (global의 줄임말)</w:t>
-      </w:r>
-    </w:p>
-    <w:p>
-      <w:r>
-        <w:t xml:space="preserve">   @anthropic-ai/claude-code = "Claude Code라는 프로그램을"</w:t>
-      </w:r>
-    </w:p>
-    <w:p/>
-    <w:p>
-      <w:r>
-        <w:t>설치에 1~3분 걸려요. 영어 글자가 쭉 올라가도 놀라지 마세요!</w:t>
-      </w:r>
-    </w:p>
-    <w:p>
-      <w:r>
-        <w:t>마지막에 "added XX packages"가 보이면 성공!</w:t>
-      </w:r>
-    </w:p>
-    <w:p/>
-    <w:p>
-      <w:pPr>
-        <w:pStyle w:val="Heading2"/>
-      </w:pPr>
-      <w:r>
-        <w:rPr>
-          <w:rFonts w:ascii="맑은 고딕" w:hAnsi="맑은 고딕" w:eastAsia="맑은 고딕"/>
-        </w:rPr>
-        <w:t>Step 2. Claude Code 처음 실행하기 (10분)</w:t>
-      </w:r>
-    </w:p>
-    <w:p>
-      <w:r>
-        <w:t>프로젝트 폴더로 이동하고 Claude를 실행합시다:</w:t>
-      </w:r>
-    </w:p>
-    <w:p>
-      <w:pPr>
-        <w:spacing w:before="80" w:after="80"/>
-        <w:ind w:left="567"/>
-      </w:pPr>
-      <w:r>
-        <w:rPr>
-          <w:rFonts w:ascii="Consolas" w:hAnsi="Consolas"/>
-          <w:color w:val="006400"/>
-          <w:sz w:val="20"/>
-        </w:rPr>
-        <w:t>cd ~/etf-dashboard</w:t>
-        <w:br/>
-        <w:t>claude</w:t>
-      </w:r>
-    </w:p>
-    <w:p/>
-    <w:p>
-      <w:r>
-        <w:t>처음 실행하면 로그인이 필요합니다.</w:t>
-      </w:r>
-    </w:p>
-    <w:p>
-      <w:r>
-        <w:t>화면에 이런 메시지가 나타나요:</w:t>
-      </w:r>
-    </w:p>
-    <w:p>
-      <w:pPr>
-        <w:spacing w:before="80" w:after="80"/>
-        <w:ind w:left="567"/>
-      </w:pPr>
-      <w:r>
-        <w:rPr>
-          <w:rFonts w:ascii="Consolas" w:hAnsi="Consolas"/>
-          <w:color w:val="006400"/>
-          <w:sz w:val="20"/>
-        </w:rPr>
-        <w:t>? How would you like to authenticate? (Use arrow keys)</w:t>
-        <w:br/>
-        <w:t>&gt; Anthropic Console (OAuth - recommended)</w:t>
-        <w:br/>
-        <w:t xml:space="preserve">  API Key</w:t>
-      </w:r>
-    </w:p>
-    <w:p/>
-    <w:p>
-      <w:r>
-        <w:t>키보드 화살표로 "Anthropic Console"이 선택된 상태에서 Enter를 누르세요.</w:t>
-      </w:r>
-    </w:p>
-    <w:p>
-      <w:r>
-        <w:t>인터넷 브라우저가 자동으로 열리면서 로그인 페이지가 나타납니다.</w:t>
-      </w:r>
-    </w:p>
-    <w:p/>
-    <w:p>
-      <w:pPr>
-        <w:pStyle w:val="Heading2"/>
-      </w:pPr>
-      <w:r>
-        <w:rPr>
-          <w:rFonts w:ascii="맑은 고딕" w:hAnsi="맑은 고딕" w:eastAsia="맑은 고딕"/>
-        </w:rPr>
-        <w:t>Step 3. Anthropic 계정 만들기/로그인 (10분)</w:t>
-      </w:r>
-    </w:p>
-    <w:p>
-      <w:r>
-        <w:t>브라우저에 로그인 화면이 나오면:</w:t>
-      </w:r>
-    </w:p>
-    <w:p/>
-    <w:p>
-      <w:r>
-        <w:t>계정이 없다면 - 새로 가입하기:</w:t>
-      </w:r>
-    </w:p>
-    <w:p>
-      <w:r>
-        <w:t xml:space="preserve">  1) "Sign up" 또는 "가입하기" 클릭</w:t>
-      </w:r>
-    </w:p>
-    <w:p>
-      <w:r>
-        <w:t xml:space="preserve">  2) 이메일 주소 입력</w:t>
-      </w:r>
-    </w:p>
-    <w:p>
-      <w:r>
-        <w:t xml:space="preserve">  3) 구글 계정으로도 가입 가능 - "Continue with Google" 클릭하면 더 간편!</w:t>
-      </w:r>
-    </w:p>
-    <w:p>
-      <w:r>
-        <w:t xml:space="preserve">  4) 이메일로 온 인증 코드 입력</w:t>
-      </w:r>
-    </w:p>
-    <w:p/>
-    <w:p>
-      <w:r>
-        <w:t>계정이 있다면 - 로그인:</w:t>
-      </w:r>
-    </w:p>
-    <w:p>
-      <w:r>
-        <w:t xml:space="preserve">  이메일과 비밀번호 입력 후 로그인</w:t>
-      </w:r>
-    </w:p>
-    <w:p/>
-    <w:p>
-      <w:r>
-        <w:t>로그인 후 "Allow" 또는 "허용" 버튼을 누르세요.</w:t>
-      </w:r>
-    </w:p>
-    <w:p/>
-    <w:p>
-      <w:r>
-        <w:t>터미널로 돌아오면 이런 화면이 보여요:</w:t>
-      </w:r>
-    </w:p>
-    <w:p>
-      <w:pPr>
-        <w:spacing w:before="80" w:after="80"/>
-        <w:ind w:left="567"/>
-      </w:pPr>
-      <w:r>
-        <w:rPr>
-          <w:rFonts w:ascii="Consolas" w:hAnsi="Consolas"/>
-          <w:color w:val="006400"/>
-          <w:sz w:val="20"/>
-        </w:rPr>
-        <w:t>&gt; Welcome to Claude Code!</w:t>
-        <w:br/>
-        <w:br/>
-        <w:t>&gt;</w:t>
-      </w:r>
-    </w:p>
-    <w:p/>
-    <w:p>
-      <w:r>
-        <w:t>축하해요! Claude Code AI 비서를 만났습니다!</w:t>
-      </w:r>
-    </w:p>
-    <w:p/>
-    <w:p>
-      <w:pPr>
-        <w:pStyle w:val="Heading2"/>
-      </w:pPr>
-      <w:r>
-        <w:rPr>
-          <w:rFonts w:ascii="맑은 고딕" w:hAnsi="맑은 고딕" w:eastAsia="맑은 고딕"/>
-        </w:rPr>
-        <w:t>Step 4. Claude에게 첫 인사 + 간단한 부탁하기 (5분)</w:t>
-      </w:r>
-    </w:p>
-    <w:p>
-      <w:r>
-        <w:t>&gt; 표시 옆에 아래처럼 입력하고 Enter:</w:t>
-      </w:r>
-    </w:p>
-    <w:p>
-      <w:pPr>
-        <w:spacing w:before="80" w:after="80"/>
-        <w:ind w:left="567"/>
-      </w:pPr>
-      <w:r>
-        <w:rPr>
-          <w:rFonts w:ascii="Consolas" w:hAnsi="Consolas"/>
-          <w:color w:val="006400"/>
-          <w:sz w:val="20"/>
-        </w:rPr>
-        <w:t>안녕! 나는 ETF 대시보드를 만들고 싶어. 도와줄 수 있어?</w:t>
-      </w:r>
-    </w:p>
-    <w:p>
-      <w:r>
-        <w:t>Claude가 한국어로 친절하게 대답해줄 거예요!</w:t>
-      </w:r>
-    </w:p>
-    <w:p/>
-    <w:p>
-      <w:r>
-        <w:t>한 가지 더 시도해볼까요? 아래처럼 입력해보세요:</w:t>
-      </w:r>
-    </w:p>
-    <w:p>
-      <w:pPr>
-        <w:spacing w:before="80" w:after="80"/>
-        <w:ind w:left="567"/>
-      </w:pPr>
-      <w:r>
-        <w:rPr>
-          <w:rFonts w:ascii="Consolas" w:hAnsi="Consolas"/>
-          <w:color w:val="006400"/>
-          <w:sz w:val="20"/>
-        </w:rPr>
-        <w:t>간단한 인사말을 출력하는 Python 파일을 만들어줘</w:t>
-      </w:r>
-    </w:p>
-    <w:p>
-      <w:r>
-        <w:t>Claude가 "파일을 만들어도 될까요?" 같은 질문을 하면</w:t>
-      </w:r>
-    </w:p>
-    <w:p>
-      <w:r>
-        <w:t>"y"를 입력하고 Enter를 누르세요 (y = yes = 네)</w:t>
-      </w:r>
-    </w:p>
-    <w:p/>
-    <w:p>
-      <w:r>
-        <w:t>Claude가 파일을 만들어주면, 아래 명령어로 확인할 수 있어요:</w:t>
-      </w:r>
-    </w:p>
-    <w:p>
-      <w:pPr>
-        <w:spacing w:before="80" w:after="80"/>
-        <w:ind w:left="567"/>
-      </w:pPr>
-      <w:r>
-        <w:rPr>
-          <w:rFonts w:ascii="Consolas" w:hAnsi="Consolas"/>
-          <w:color w:val="006400"/>
-          <w:sz w:val="20"/>
-        </w:rPr>
-        <w:t>/exit</w:t>
-        <w:br/>
-        <w:t>ls</w:t>
-      </w:r>
-    </w:p>
-    <w:p>
-      <w:r>
-        <w:t>새로 만들어진 .py 파일이 보일 거예요!</w:t>
-      </w:r>
-    </w:p>
-    <w:p/>
-    <w:p>
-      <w:r>
-        <w:t>TIP: Claude Code를 끝내려면 Ctrl+C 또는 /exit 입력</w:t>
-      </w:r>
-    </w:p>
-    <w:p/>
-    <w:p>
-      <w:pPr>
-        <w:pStyle w:val="Heading2"/>
-      </w:pPr>
-      <w:r>
-        <w:rPr>
-          <w:rFonts w:ascii="맑은 고딕" w:hAnsi="맑은 고딕" w:eastAsia="맑은 고딕"/>
-        </w:rPr>
-        <w:t>CHECK 체크포인트</w:t>
-      </w:r>
-    </w:p>
-    <w:p>
-      <w:r>
-        <w:rPr>
-          <w:rFonts w:ascii="맑은 고딕" w:hAnsi="맑은 고딕" w:eastAsia="맑은 고딕"/>
-          <w:color w:val="008000"/>
-        </w:rPr>
-        <w:t>CHECK: claude 명령어로 "Welcome to Claude Code" 화면이 나왔나요?</w:t>
-      </w:r>
-    </w:p>
-    <w:p>
-      <w:r>
-        <w:rPr>
-          <w:rFonts w:ascii="맑은 고딕" w:hAnsi="맑은 고딕" w:eastAsia="맑은 고딕"/>
-          <w:color w:val="008000"/>
-        </w:rPr>
-        <w:t>CHECK: Claude에게 한국어 메시지를 보내고 답변을 받았나요?</w:t>
-      </w:r>
-    </w:p>
-    <w:p>
-      <w:r>
-        <w:rPr>
-          <w:rFonts w:ascii="맑은 고딕" w:hAnsi="맑은 고딕" w:eastAsia="맑은 고딕"/>
-          <w:color w:val="008000"/>
-        </w:rPr>
-        <w:t>CHECK: Claude에게 파일 만들기를 부탁하고 성공했나요?</w:t>
-      </w:r>
-    </w:p>
-    <w:p/>
-    <w:p>
-      <w:pPr>
-        <w:pStyle w:val="Heading2"/>
-      </w:pPr>
-      <w:r>
-        <w:rPr>
-          <w:rFonts w:ascii="맑은 고딕" w:hAnsi="맑은 고딕" w:eastAsia="맑은 고딕"/>
-        </w:rPr>
-        <w:t>!! 막혔을 때</w:t>
-      </w:r>
-    </w:p>
-    <w:tbl>
-      <w:tblPr>
-        <w:tblStyle w:val="LightGrid-Accent1"/>
-        <w:tblW w:type="auto" w:w="0"/>
-        <w:jc w:val="center"/>
-        <w:tblLook w:firstColumn="1" w:firstRow="1" w:lastColumn="0" w:lastRow="0" w:noHBand="0" w:noVBand="1" w:val="04A0"/>
-      </w:tblPr>
-      <w:tblGrid>
-        <w:gridCol w:w="2880"/>
-        <w:gridCol w:w="2880"/>
-        <w:gridCol w:w="2880"/>
-      </w:tblGrid>
-      <w:tr>
-        <w:tc>
-          <w:tcPr>
-            <w:tcW w:type="dxa" w:w="2880"/>
-          </w:tcPr>
-          <w:p>
-            <w:r>
-              <w:rPr>
-                <w:b/>
-              </w:rPr>
-              <w:t>증상</w:t>
-            </w:r>
-          </w:p>
-        </w:tc>
-        <w:tc>
-          <w:tcPr>
-            <w:tcW w:type="dxa" w:w="2880"/>
-          </w:tcPr>
-          <w:p>
-            <w:r>
-              <w:rPr>
-                <w:b/>
-              </w:rPr>
-              <w:t>원인</w:t>
-            </w:r>
-          </w:p>
-        </w:tc>
-        <w:tc>
-          <w:tcPr>
-            <w:tcW w:type="dxa" w:w="2880"/>
-          </w:tcPr>
-          <w:p>
-            <w:r>
-              <w:rPr>
-                <w:b/>
-              </w:rPr>
-              <w:t>해결법</w:t>
+              <w:t>Git Bash를 완전히 닫고 새로 여세요</w:t>
             </w:r>
           </w:p>
         </w:tc>
@@ -2380,7 +1575,7 @@
           </w:tcPr>
           <w:p>
             <w:r>
-              <w:t>npm 설치 실패 또는 경로 문제</w:t>
+              <w:t>npm 설치 실패</w:t>
             </w:r>
           </w:p>
         </w:tc>
@@ -2459,38 +1654,6 @@
           </w:p>
         </w:tc>
       </w:tr>
-      <w:tr>
-        <w:tc>
-          <w:tcPr>
-            <w:tcW w:type="dxa" w:w="2880"/>
-          </w:tcPr>
-          <w:p>
-            <w:r>
-              <w:t>무료 사용량 초과 메시지</w:t>
-            </w:r>
-          </w:p>
-        </w:tc>
-        <w:tc>
-          <w:tcPr>
-            <w:tcW w:type="dxa" w:w="2880"/>
-          </w:tcPr>
-          <w:p>
-            <w:r>
-              <w:t>Claude 무료 한도 도달</w:t>
-            </w:r>
-          </w:p>
-        </w:tc>
-        <w:tc>
-          <w:tcPr>
-            <w:tcW w:type="dxa" w:w="2880"/>
-          </w:tcPr>
-          <w:p>
-            <w:r>
-              <w:t>잠시 후 다시 시도하거나, Pro 구독 고려</w:t>
-            </w:r>
-          </w:p>
-        </w:tc>
-      </w:tr>
     </w:tbl>
     <w:p/>
     <w:p>
@@ -2501,7 +1664,7 @@
           <w:color w:val="008000"/>
           <w:sz w:val="24"/>
         </w:rPr>
-        <w:t>3회차 완료! 수고하셨습니다!</w:t>
+        <w:t>1회차 완료! 수고하셨습니다!</w:t>
       </w:r>
     </w:p>
     <w:p>
@@ -2510,7 +1673,16 @@
           <w:rFonts w:ascii="맑은 고딕" w:hAnsi="맑은 고딕" w:eastAsia="맑은 고딕"/>
           <w:i/>
         </w:rPr>
-        <w:t>다음 회차에서 유튜브 API 열쇠를 받고 데이터 수집을 시작해요!</w:t>
+        <w:t>오늘 한 번에 터미널, Git, Node.js, Claude Code까지 설치했어요! 대단해요!</w:t>
+      </w:r>
+    </w:p>
+    <w:p>
+      <w:r>
+        <w:rPr>
+          <w:rFonts w:ascii="맑은 고딕" w:hAnsi="맑은 고딕" w:eastAsia="맑은 고딕"/>
+          <w:i/>
+        </w:rPr>
+        <w:t>다음 회차에서 Python을 설치하고 유튜브 API 열쇠를 받아요.</w:t>
       </w:r>
     </w:p>
     <w:p>
@@ -2526,7 +1698,7 @@
         <w:rPr>
           <w:rFonts w:ascii="맑은 고딕" w:hAnsi="맑은 고딕" w:eastAsia="맑은 고딕"/>
         </w:rPr>
-        <w:t>4회차: YouTube API 키 발급 + 데이터 수집 시작</w:t>
+        <w:t>2회차: Python 설치 + YouTube API 키 발급</w:t>
       </w:r>
     </w:p>
     <w:p>
@@ -2536,7 +1708,7 @@
           <w:b/>
           <w:color w:val="0064C8"/>
         </w:rPr>
-        <w:t>소요 시간: 30분</w:t>
+        <w:t>소요 시간: 35분</w:t>
       </w:r>
     </w:p>
     <w:p>
@@ -2545,7 +1717,7 @@
           <w:rFonts w:ascii="맑은 고딕" w:hAnsi="맑은 고딕" w:eastAsia="맑은 고딕"/>
           <w:b/>
         </w:rPr>
-        <w:t>이 회차를 마치면: 유튜브에서 ETF 관련 영상 데이터를 자동으로 가져올 수 있는 열쇠(API 키)를 갖게 되고, 데이터 수집 프로그램이 만들어져요!</w:t>
+        <w:t>이 회차를 마치면: Python이 설치되고, 유튜브에서 데이터를 가져올 수 있는 열쇠(API 키)를 갖게 되고, 데이터 수집 프로그램까지 만들어져요!</w:t>
       </w:r>
     </w:p>
     <w:p/>
@@ -2557,7 +1729,142 @@
         <w:rPr>
           <w:rFonts w:ascii="맑은 고딕" w:hAnsi="맑은 고딕" w:eastAsia="맑은 고딕"/>
         </w:rPr>
-        <w:t>Step 1. Google Cloud Console 접속 (3분)</w:t>
+        <w:t>Step 1. Python 설치하기 (10분)</w:t>
+      </w:r>
+    </w:p>
+    <w:p>
+      <w:r>
+        <w:t>&gt;&gt; Python(파이썬)이 뭔가요?</w:t>
+      </w:r>
+    </w:p>
+    <w:p>
+      <w:r>
+        <w:t>컴퓨터 프로그래밍 언어예요. 영어처럼 읽기 쉬워서 초보자에게 인기가 많아요.</w:t>
+      </w:r>
+    </w:p>
+    <w:p>
+      <w:r>
+        <w:t>우리는 데이터를 수집할 때 Python을 사용할 거예요.</w:t>
+      </w:r>
+    </w:p>
+    <w:p/>
+    <w:p>
+      <w:r>
+        <w:t>브라우저에서 아래 주소로 이동하세요:</w:t>
+      </w:r>
+    </w:p>
+    <w:p>
+      <w:pPr>
+        <w:spacing w:before="80" w:after="80"/>
+        <w:ind w:left="567"/>
+      </w:pPr>
+      <w:r>
+        <w:rPr>
+          <w:rFonts w:ascii="Consolas" w:hAnsi="Consolas"/>
+          <w:color w:val="006400"/>
+          <w:sz w:val="20"/>
+        </w:rPr>
+        <w:t>https://www.python.org/downloads/</w:t>
+      </w:r>
+    </w:p>
+    <w:p>
+      <w:r>
+        <w:t>노란색 "Download Python 3.x.x" 버튼을 클릭하세요.</w:t>
+      </w:r>
+    </w:p>
+    <w:p/>
+    <w:p>
+      <w:r>
+        <w:t>다운로드된 파일을 실행하면 설치 화면이 나옵니다.</w:t>
+      </w:r>
+    </w:p>
+    <w:p/>
+    <w:p>
+      <w:r>
+        <w:t>!! 가장 중요한 순간!</w:t>
+      </w:r>
+    </w:p>
+    <w:p>
+      <w:r>
+        <w:t>!! 맨 아래에 "Add python.exe to PATH"라는 체크박스가 보입니다.</w:t>
+      </w:r>
+    </w:p>
+    <w:p>
+      <w:r>
+        <w:t>!! 이것을 반.드.시. 체크하세요!</w:t>
+      </w:r>
+    </w:p>
+    <w:p>
+      <w:r>
+        <w:t>!! (체크 안 하면 나중에 python 명령어가 안 먹어서 큰 문제가 생겨요)</w:t>
+      </w:r>
+    </w:p>
+    <w:p/>
+    <w:p>
+      <w:r>
+        <w:t>체크한 후 "Install Now"를 클릭하세요.</w:t>
+      </w:r>
+    </w:p>
+    <w:p>
+      <w:r>
+        <w:t>설치가 끝나면 "Close"를 누르세요.</w:t>
+      </w:r>
+    </w:p>
+    <w:p/>
+    <w:p>
+      <w:r>
+        <w:t>Git Bash를 껐다가 다시 열고 확인:</w:t>
+      </w:r>
+    </w:p>
+    <w:p>
+      <w:pPr>
+        <w:spacing w:before="80" w:after="80"/>
+        <w:ind w:left="567"/>
+      </w:pPr>
+      <w:r>
+        <w:rPr>
+          <w:rFonts w:ascii="Consolas" w:hAnsi="Consolas"/>
+          <w:color w:val="006400"/>
+          <w:sz w:val="20"/>
+        </w:rPr>
+        <w:t>python --version</w:t>
+      </w:r>
+    </w:p>
+    <w:p>
+      <w:r>
+        <w:t>Python 3.x.x가 나오면 성공!</w:t>
+      </w:r>
+    </w:p>
+    <w:p/>
+    <w:p>
+      <w:pPr>
+        <w:spacing w:before="80" w:after="80"/>
+        <w:ind w:left="567"/>
+      </w:pPr>
+      <w:r>
+        <w:rPr>
+          <w:rFonts w:ascii="Consolas" w:hAnsi="Consolas"/>
+          <w:color w:val="006400"/>
+          <w:sz w:val="20"/>
+        </w:rPr>
+        <w:t>pip --version</w:t>
+      </w:r>
+    </w:p>
+    <w:p>
+      <w:r>
+        <w:t>&gt;&gt; pip = Python의 앱스토어. 필요한 재료를 설치하는 도구. 숫자가 나오면 OK!</w:t>
+      </w:r>
+    </w:p>
+    <w:p/>
+    <w:p>
+      <w:pPr>
+        <w:pStyle w:val="Heading2"/>
+      </w:pPr>
+      <w:r>
+        <w:rPr>
+          <w:rFonts w:ascii="맑은 고딕" w:hAnsi="맑은 고딕" w:eastAsia="맑은 고딕"/>
+        </w:rPr>
+        <w:t>Step 2. Google Cloud Console 접속 (3분)</w:t>
       </w:r>
     </w:p>
     <w:p>
@@ -2614,7 +1921,7 @@
         <w:rPr>
           <w:rFonts w:ascii="맑은 고딕" w:hAnsi="맑은 고딕" w:eastAsia="맑은 고딕"/>
         </w:rPr>
-        <w:t>Step 2. 새 프로젝트 만들기 (3분)</w:t>
+        <w:t>Step 3. 새 프로젝트 만들기 (3분)</w:t>
       </w:r>
     </w:p>
     <w:p>
@@ -2666,7 +1973,7 @@
         <w:rPr>
           <w:rFonts w:ascii="맑은 고딕" w:hAnsi="맑은 고딕" w:eastAsia="맑은 고딕"/>
         </w:rPr>
-        <w:t>Step 3. YouTube Data API 활성화 (3분)</w:t>
+        <w:t>Step 4. YouTube Data API 활성화 (3분)</w:t>
       </w:r>
     </w:p>
     <w:p>
@@ -2718,7 +2025,7 @@
         <w:rPr>
           <w:rFonts w:ascii="맑은 고딕" w:hAnsi="맑은 고딕" w:eastAsia="맑은 고딕"/>
         </w:rPr>
-        <w:t>Step 4. API 키 만들기 (3분)</w:t>
+        <w:t>Step 5. API 키 만들기 (3분)</w:t>
       </w:r>
     </w:p>
     <w:p>
@@ -2782,7 +2089,7 @@
         <w:rPr>
           <w:rFonts w:ascii="맑은 고딕" w:hAnsi="맑은 고딕" w:eastAsia="맑은 고딕"/>
         </w:rPr>
-        <w:t>Step 5. API 키를 프로젝트에 저장 (3분)</w:t>
+        <w:t>Step 6. API 키를 프로젝트에 저장 (3분)</w:t>
       </w:r>
     </w:p>
     <w:p>
@@ -2870,7 +2177,7 @@
         <w:rPr>
           <w:rFonts w:ascii="맑은 고딕" w:hAnsi="맑은 고딕" w:eastAsia="맑은 고딕"/>
         </w:rPr>
-        <w:t>Step 6. Claude에게 데이터 수집 프로그램 만들어달라고 부탁 (10분)</w:t>
+        <w:t>Step 7. Claude에게 데이터 수집 프로그램 만들어달라고 부탁 (5분)</w:t>
       </w:r>
     </w:p>
     <w:p>
@@ -3010,6 +2317,15 @@
           <w:rFonts w:ascii="맑은 고딕" w:hAnsi="맑은 고딕" w:eastAsia="맑은 고딕"/>
         </w:rPr>
         <w:t>CHECK 체크포인트</w:t>
+      </w:r>
+    </w:p>
+    <w:p>
+      <w:r>
+        <w:rPr>
+          <w:rFonts w:ascii="맑은 고딕" w:hAnsi="맑은 고딕" w:eastAsia="맑은 고딕"/>
+          <w:color w:val="008000"/>
+        </w:rPr>
+        <w:t>CHECK: python --version 결과에 Python 3.x.x가 나왔나요?</w:t>
       </w:r>
     </w:p>
     <w:p>
@@ -3100,6 +2416,70 @@
                 <w:b/>
               </w:rPr>
               <w:t>해결법</w:t>
+            </w:r>
+          </w:p>
+        </w:tc>
+      </w:tr>
+      <w:tr>
+        <w:tc>
+          <w:tcPr>
+            <w:tcW w:type="dxa" w:w="2880"/>
+          </w:tcPr>
+          <w:p>
+            <w:r>
+              <w:t>python 대신 Microsoft Store가 열려요</w:t>
+            </w:r>
+          </w:p>
+        </w:tc>
+        <w:tc>
+          <w:tcPr>
+            <w:tcW w:type="dxa" w:w="2880"/>
+          </w:tcPr>
+          <w:p>
+            <w:r>
+              <w:t>Windows 앱 별칭 문제</w:t>
+            </w:r>
+          </w:p>
+        </w:tc>
+        <w:tc>
+          <w:tcPr>
+            <w:tcW w:type="dxa" w:w="2880"/>
+          </w:tcPr>
+          <w:p>
+            <w:r>
+              <w:t>Git Bash에서는 보통 안 생겨요. 생기면 python3으로 시도</w:t>
+            </w:r>
+          </w:p>
+        </w:tc>
+      </w:tr>
+      <w:tr>
+        <w:tc>
+          <w:tcPr>
+            <w:tcW w:type="dxa" w:w="2880"/>
+          </w:tcPr>
+          <w:p>
+            <w:r>
+              <w:t>"Add python.exe to PATH" 체크를 깜빡했어요</w:t>
+            </w:r>
+          </w:p>
+        </w:tc>
+        <w:tc>
+          <w:tcPr>
+            <w:tcW w:type="dxa" w:w="2880"/>
+          </w:tcPr>
+          <w:p>
+            <w:r>
+              <w:t>PATH 미등록</w:t>
+            </w:r>
+          </w:p>
+        </w:tc>
+        <w:tc>
+          <w:tcPr>
+            <w:tcW w:type="dxa" w:w="2880"/>
+          </w:tcPr>
+          <w:p>
+            <w:r>
+              <w:t>Python을 삭제 후 다시 설치하면서 이번엔 꼭 체크!</w:t>
             </w:r>
           </w:p>
         </w:tc>
@@ -3242,7 +2622,7 @@
           <w:color w:val="008000"/>
           <w:sz w:val="24"/>
         </w:rPr>
-        <w:t>4회차 완료! 수고하셨습니다!</w:t>
+        <w:t>2회차 완료! 수고하셨습니다!</w:t>
       </w:r>
     </w:p>
     <w:p>
@@ -3267,7 +2647,7 @@
         <w:rPr>
           <w:rFonts w:ascii="맑은 고딕" w:hAnsi="맑은 고딕" w:eastAsia="맑은 고딕"/>
         </w:rPr>
-        <w:t>5회차: 데이터 수집 실행 + 대시보드 제작</w:t>
+        <w:t>3회차: 데이터 수집 실행 + 대시보드 제작</w:t>
       </w:r>
     </w:p>
     <w:p>
@@ -3277,7 +2657,7 @@
           <w:b/>
           <w:color w:val="0064C8"/>
         </w:rPr>
-        <w:t>소요 시간: 30분</w:t>
+        <w:t>소요 시간: 35분</w:t>
       </w:r>
     </w:p>
     <w:p>
@@ -4013,7 +3393,7 @@
           <w:color w:val="008000"/>
           <w:sz w:val="24"/>
         </w:rPr>
-        <w:t>5회차 완료! 핵심 프로젝트가 완성됐어요!</w:t>
+        <w:t>3회차 완료! 핵심 프로젝트가 완성됐어요!</w:t>
       </w:r>
     </w:p>
     <w:p>
@@ -4038,7 +3418,7 @@
         <w:rPr>
           <w:rFonts w:ascii="맑은 고딕" w:hAnsi="맑은 고딕" w:eastAsia="맑은 고딕"/>
         </w:rPr>
-        <w:t>6회차: GitHub에 내 프로젝트 공유하기</w:t>
+        <w:t>4회차: GitHub에 내 프로젝트 공유하기</w:t>
       </w:r>
     </w:p>
     <w:p>
@@ -4974,7 +4354,7 @@
           <w:color w:val="008000"/>
           <w:sz w:val="32"/>
         </w:rPr>
-        <w:t>6회차 &amp; 전체 강의 완료! 축하합니다!!!</w:t>
+        <w:t>4회차 &amp; 전체 강의 완료! 축하합니다!!!</w:t>
       </w:r>
     </w:p>
     <w:p>
@@ -5001,7 +4381,7 @@
           <w:i/>
           <w:sz w:val="24"/>
         </w:rPr>
-        <w:t>6회차 강의 전체 흐름을 한눈에 확인하세요!</w:t>
+        <w:t>전체 흐름을 한눈에 확인하세요!</w:t>
       </w:r>
     </w:p>
     <w:p/>
@@ -5080,7 +4460,7 @@
             <w:r>
               <w:t>1회차</w:t>
               <w:br/>
-              <w:t>(30분)</w:t>
+              <w:t>(40분)</w:t>
             </w:r>
           </w:p>
         </w:tc>
@@ -5090,9 +4470,9 @@
           </w:tcPr>
           <w:p>
             <w:r>
-              <w:t>터미널과</w:t>
+              <w:t>터미널부터</w:t>
               <w:br/>
-              <w:t>친해지기</w:t>
+              <w:t>AI 비서까지</w:t>
             </w:r>
           </w:p>
         </w:tc>
@@ -5106,7 +4486,11 @@
               <w:br/>
               <w:t>- PowerShell/CMD/Git Bash 비교</w:t>
               <w:br/>
-              <w:t>- Git 설치 + Git Bash 사용</w:t>
+              <w:t>- Git 설치</w:t>
+              <w:br/>
+              <w:t>- Node.js 설치</w:t>
+              <w:br/>
+              <w:t>- Claude Code 설치 + 첫 대화!</w:t>
             </w:r>
           </w:p>
         </w:tc>
@@ -5116,11 +4500,11 @@
           </w:tcPr>
           <w:p>
             <w:r>
-              <w:t>터미널 사용 가능</w:t>
+              <w:t>터미널, Git, Node.js,</w:t>
               <w:br/>
-              <w:t>Git Bash 열기 성공</w:t>
+              <w:t>Claude Code 모두 작동</w:t>
               <w:br/>
-              <w:t>프로젝트 폴더 생성</w:t>
+              <w:t>AI와 첫 대화 성공!</w:t>
             </w:r>
           </w:p>
         </w:tc>
@@ -5130,9 +4514,11 @@
           </w:tcPr>
           <w:p>
             <w:r>
-              <w:t>MS Store</w:t>
+              <w:t>MS Store, Git</w:t>
               <w:br/>
-              <w:t>Git</w:t>
+              <w:t>Node.js</w:t>
+              <w:br/>
+              <w:t>Claude Code</w:t>
             </w:r>
           </w:p>
         </w:tc>
@@ -5146,7 +4532,7 @@
             <w:r>
               <w:t>2회차</w:t>
               <w:br/>
-              <w:t>(30분)</w:t>
+              <w:t>(35분)</w:t>
             </w:r>
           </w:p>
         </w:tc>
@@ -5156,9 +4542,9 @@
           </w:tcPr>
           <w:p>
             <w:r>
-              <w:t>프로그래밍</w:t>
+              <w:t>Python +</w:t>
               <w:br/>
-              <w:t>도구 설치</w:t>
+              <w:t>YouTube API</w:t>
             </w:r>
           </w:p>
         </w:tc>
@@ -5168,137 +4554,9 @@
           </w:tcPr>
           <w:p>
             <w:r>
-              <w:t>- Node.js 설치</w:t>
-              <w:br/>
               <w:t>- Python 설치</w:t>
               <w:br/>
-              <w:t>- npm, pip 확인</w:t>
-            </w:r>
-          </w:p>
-        </w:tc>
-        <w:tc>
-          <w:tcPr>
-            <w:tcW w:type="dxa" w:w="1728"/>
-          </w:tcPr>
-          <w:p>
-            <w:r>
-              <w:t>node, npm 작동</w:t>
-              <w:br/>
-              <w:t>python, pip 작동</w:t>
-            </w:r>
-          </w:p>
-        </w:tc>
-        <w:tc>
-          <w:tcPr>
-            <w:tcW w:type="dxa" w:w="1728"/>
-          </w:tcPr>
-          <w:p>
-            <w:r>
-              <w:t>Node.js</w:t>
-              <w:br/>
-              <w:t>Python</w:t>
-            </w:r>
-          </w:p>
-        </w:tc>
-      </w:tr>
-      <w:tr>
-        <w:tc>
-          <w:tcPr>
-            <w:tcW w:type="dxa" w:w="1728"/>
-          </w:tcPr>
-          <w:p>
-            <w:r>
-              <w:t>3회차</w:t>
-              <w:br/>
-              <w:t>(30분)</w:t>
-            </w:r>
-          </w:p>
-        </w:tc>
-        <w:tc>
-          <w:tcPr>
-            <w:tcW w:type="dxa" w:w="1728"/>
-          </w:tcPr>
-          <w:p>
-            <w:r>
-              <w:t>Claude Code</w:t>
-              <w:br/>
-              <w:t>설치 + 첫 실행</w:t>
-            </w:r>
-          </w:p>
-        </w:tc>
-        <w:tc>
-          <w:tcPr>
-            <w:tcW w:type="dxa" w:w="1728"/>
-          </w:tcPr>
-          <w:p>
-            <w:r>
-              <w:t>- Claude Code 설치</w:t>
-              <w:br/>
-              <w:t>- Anthropic 계정 가입</w:t>
-              <w:br/>
-              <w:t>- AI와 첫 대화</w:t>
-            </w:r>
-          </w:p>
-        </w:tc>
-        <w:tc>
-          <w:tcPr>
-            <w:tcW w:type="dxa" w:w="1728"/>
-          </w:tcPr>
-          <w:p>
-            <w:r>
-              <w:t>Claude AI와</w:t>
-              <w:br/>
-              <w:t>대화 성공</w:t>
-            </w:r>
-          </w:p>
-        </w:tc>
-        <w:tc>
-          <w:tcPr>
-            <w:tcW w:type="dxa" w:w="1728"/>
-          </w:tcPr>
-          <w:p>
-            <w:r>
-              <w:t>npm</w:t>
-              <w:br/>
-              <w:t>Claude Code</w:t>
-            </w:r>
-          </w:p>
-        </w:tc>
-      </w:tr>
-      <w:tr>
-        <w:tc>
-          <w:tcPr>
-            <w:tcW w:type="dxa" w:w="1728"/>
-          </w:tcPr>
-          <w:p>
-            <w:r>
-              <w:t>4회차</w:t>
-              <w:br/>
-              <w:t>(30분)</w:t>
-            </w:r>
-          </w:p>
-        </w:tc>
-        <w:tc>
-          <w:tcPr>
-            <w:tcW w:type="dxa" w:w="1728"/>
-          </w:tcPr>
-          <w:p>
-            <w:r>
-              <w:t>YouTube API</w:t>
-              <w:br/>
-              <w:t>+ 수집 프로그램</w:t>
-            </w:r>
-          </w:p>
-        </w:tc>
-        <w:tc>
-          <w:tcPr>
-            <w:tcW w:type="dxa" w:w="1728"/>
-          </w:tcPr>
-          <w:p>
-            <w:r>
-              <w:t>- Google Cloud 프로젝트</w:t>
-              <w:br/>
-              <w:t>- API 키 발급</w:t>
+              <w:t>- Google Cloud API 키 발급</w:t>
               <w:br/>
               <w:t>- Claude에게 수집 코드 부탁</w:t>
             </w:r>
@@ -5310,6 +4568,8 @@
           </w:tcPr>
           <w:p>
             <w:r>
+              <w:t>Python 작동</w:t>
+              <w:br/>
               <w:t>API 키 저장</w:t>
               <w:br/>
               <w:t>collect_data.py 생성</w:t>
@@ -5322,6 +4582,8 @@
           </w:tcPr>
           <w:p>
             <w:r>
+              <w:t>Python</w:t>
+              <w:br/>
               <w:t>Google Cloud</w:t>
               <w:br/>
               <w:t>Claude Code</w:t>
@@ -5336,9 +4598,9 @@
           </w:tcPr>
           <w:p>
             <w:r>
-              <w:t>5회차</w:t>
+              <w:t>3회차</w:t>
               <w:br/>
-              <w:t>(30분)</w:t>
+              <w:t>(35분)</w:t>
             </w:r>
           </w:p>
         </w:tc>
@@ -5364,7 +4626,7 @@
               <w:br/>
               <w:t>- Claude에게 대시보드 부탁</w:t>
               <w:br/>
-              <w:t>- 브라우저에서 확인</w:t>
+              <w:t>- 브라우저에서 확인!</w:t>
             </w:r>
           </w:p>
         </w:tc>
@@ -5377,6 +4639,8 @@
               <w:t>etf_youtube_data.json</w:t>
               <w:br/>
               <w:t>index.html 대시보드</w:t>
+              <w:br/>
+              <w:t>브라우저에서 확인!</w:t>
             </w:r>
           </w:p>
         </w:tc>
@@ -5402,7 +4666,7 @@
           </w:tcPr>
           <w:p>
             <w:r>
-              <w:t>6회차</w:t>
+              <w:t>4회차</w:t>
               <w:br/>
               <w:t>(30분)</w:t>
             </w:r>
@@ -5468,7 +4732,7 @@
           <w:b/>
           <w:sz w:val="26"/>
         </w:rPr>
-        <w:t>총 소요 시간: 6회차 x 30분 = 약 3시간</w:t>
+        <w:t>총 소요 시간: 4회차 = 약 2시간 20분</w:t>
       </w:r>
     </w:p>
     <w:p/>
@@ -5490,27 +4754,19 @@
           <w:rFonts w:ascii="맑은 고딕" w:hAnsi="맑은 고딕" w:eastAsia="맑은 고딕"/>
           <w:sz w:val="22"/>
         </w:rPr>
-        <w:t>[1회차] 터미널 설치 + Git 설치</w:t>
+        <w:t>[1회차] 터미널 + Git + Node.js + Claude Code 첫 실행!</w:t>
         <w:br/>
         <w:t xml:space="preserve">         |</w:t>
         <w:br/>
-        <w:t>[2회차] Node.js + Python 설치</w:t>
+        <w:t>[2회차] Python 설치 + YouTube API 키 + 수집 프로그램 생성</w:t>
         <w:br/>
         <w:t xml:space="preserve">         |</w:t>
         <w:br/>
-        <w:t>[3회차] Claude Code 설치 + AI와 첫 대화</w:t>
+        <w:t>[3회차] 데이터 수집 실행 + 대시보드 제작 + 브라우저 확인!</w:t>
         <w:br/>
         <w:t xml:space="preserve">         |</w:t>
         <w:br/>
-        <w:t>[4회차] YouTube API 키 발급 + 수집 프로그램 생성</w:t>
-        <w:br/>
-        <w:t xml:space="preserve">         |</w:t>
-        <w:br/>
-        <w:t>[5회차] 데이터 수집 실행 + 대시보드 제작 + 브라우저 확인!</w:t>
-        <w:br/>
-        <w:t xml:space="preserve">         |</w:t>
-        <w:br/>
-        <w:t>[6회차] GitHub 가입 + 프로젝트 공유 -&gt; 완성!</w:t>
+        <w:t>[4회차] GitHub 가입 + 프로젝트 공유 -&gt; 완성!</w:t>
       </w:r>
     </w:p>
     <w:p/>
@@ -5529,7 +4785,7 @@
     <w:p/>
     <w:p>
       <w:r>
-        <w:t>축하합니다! 6회에 걸쳐 여러분은:</w:t>
+        <w:t>축하합니다! 4회에 걸쳐 여러분은:</w:t>
       </w:r>
     </w:p>
     <w:p>

</xml_diff>